<commit_message>
feat: simplified Assessment, shortened Academic Integrity, conditional Marking Scheme rules
- Assessment: removed URL, simplified to plain policy statement (EN/ZH/PT)
- Academic Integrity: removed URL link at end of paragraph (EN/ZH/PT)
- Marking Scheme: 4 rules per class (1=none, 2=final<35 resit, 3=cw+final<35 resit, 4=cw+final<35 fail)
- Added marking_rule column to classes table (schema, seed, import)
- Added MARKING_RULES trilingual text dict to generator.py
- Fixed set_para_text to strip hyperlink elements from paragraphs
</commit_message>
<xml_diff>
--- a/backend/templates/template_en.docx
+++ b/backend/templates/template_en.docx
@@ -3917,52 +3917,37 @@
           <w:rFonts w:ascii="Calibri" w:hAnsi="Calibri" w:cs="Calibri"/>
           <w:lang w:val="en-GB"/>
         </w:rPr>
-        <w:t xml:space="preserve">The assessment will be conducted </w:t>
-      </w:r>
-      <w:r>
-        <w:rPr>
-          <w:rFonts w:ascii="Calibri" w:hAnsi="Calibri" w:cs="Calibri"/>
-          <w:lang w:val="en-GB"/>
-        </w:rPr>
-        <w:t xml:space="preserve">following the University’s </w:t>
-      </w:r>
-      <w:r>
-        <w:rPr>
-          <w:rFonts w:ascii="Calibri" w:hAnsi="Calibri" w:cs="Calibri"/>
-          <w:lang w:val="en-GB"/>
-        </w:rPr>
-        <w:t>Assessment Strategy</w:t>
-      </w:r>
-      <w:r>
-        <w:rPr>
-          <w:rFonts w:ascii="Calibri" w:hAnsi="Calibri" w:cs="Calibri"/>
-          <w:lang w:val="en-GB"/>
-        </w:rPr>
-        <w:t xml:space="preserve"> (see </w:t>
-      </w:r>
-      <w:hyperlink r:id="rId8" w:history="1">
-        <w:r>
-          <w:rPr>
-            <w:rStyle w:val="a3"/>
-            <w:rFonts w:ascii="Calibri" w:hAnsi="Calibri" w:cs="Calibri"/>
-            <w:lang w:val="en-GB"/>
-          </w:rPr>
-          <w:t>www.mpu.edu.mo/teaching_learning/en/assessment_strategy.php</w:t>
-        </w:r>
-      </w:hyperlink>
-      <w:r>
-        <w:rPr>
-          <w:rFonts w:ascii="Calibri" w:hAnsi="Calibri" w:cs="Calibri"/>
-          <w:lang w:val="en-GB"/>
-        </w:rPr>
-        <w:t>)</w:t>
-      </w:r>
-      <w:r>
-        <w:rPr>
-          <w:rFonts w:ascii="Calibri" w:hAnsi="Calibri" w:cs="Calibri"/>
-          <w:lang w:val="en-GB"/>
-        </w:rPr>
-        <w:t>. Passing this learning module indicates that students will have attained the ILOs of this learning module and thus acquired its credits.</w:t>
+        <w:t>The assessment will be conducted following the University’s Assessment Strategy. Passing this learning module indicates that students will have attained the ILOs of this learning module and thus acquired its credits.</w:t>
+      </w:r>
+      <w:r>
+        <w:rPr>
+          <w:rFonts w:ascii="Calibri" w:hAnsi="Calibri" w:cs="Calibri"/>
+          <w:lang w:val="en-GB"/>
+        </w:rPr>
+      </w:r>
+      <w:r>
+        <w:rPr>
+          <w:rFonts w:ascii="Calibri" w:hAnsi="Calibri" w:cs="Calibri"/>
+          <w:lang w:val="en-GB"/>
+        </w:rPr>
+      </w:r>
+      <w:r>
+        <w:rPr>
+          <w:rFonts w:ascii="Calibri" w:hAnsi="Calibri" w:cs="Calibri"/>
+          <w:lang w:val="en-GB"/>
+        </w:rPr>
+      </w:r>
+      <w:r>
+        <w:rPr>
+          <w:rFonts w:ascii="Calibri" w:hAnsi="Calibri" w:cs="Calibri"/>
+          <w:lang w:val="en-GB"/>
+        </w:rPr>
+      </w:r>
+      <w:r>
+        <w:rPr>
+          <w:rFonts w:ascii="Calibri" w:hAnsi="Calibri" w:cs="Calibri"/>
+          <w:lang w:val="en-GB"/>
+        </w:rPr>
       </w:r>
     </w:p>
     <w:p>
@@ -4009,14 +3994,13 @@
           <w:rFonts w:ascii="Calibri" w:hAnsi="Calibri" w:cs="Calibri" w:hint="eastAsia"/>
           <w:lang w:val="en-GB"/>
         </w:rPr>
-        <w:t>[</w:t>
-      </w:r>
-      <w:r>
-        <w:rPr>
-          <w:rFonts w:ascii="Calibri" w:hAnsi="Calibri" w:cs="Calibri"/>
-          <w:lang w:val="en-GB"/>
-        </w:rPr>
-        <w:t>Insert marking scheme]</w:t>
+        <w:t>{{ marking_scheme_text }}</w:t>
+      </w:r>
+      <w:r>
+        <w:rPr>
+          <w:rFonts w:ascii="Calibri" w:hAnsi="Calibri" w:cs="Calibri"/>
+          <w:lang w:val="en-GB"/>
+        </w:rPr>
       </w:r>
     </w:p>
     <w:p>
@@ -4351,115 +4335,91 @@
           <w:rFonts w:ascii="Calibri" w:hAnsi="Calibri" w:cs="Calibri"/>
           <w:lang w:val="en-GB"/>
         </w:rPr>
-        <w:t>The Macao Polytechnic University</w:t>
-      </w:r>
-      <w:r>
-        <w:rPr>
-          <w:rFonts w:ascii="Calibri" w:hAnsi="Calibri" w:cs="Calibri"/>
-          <w:lang w:val="en-GB"/>
-        </w:rPr>
-        <w:t xml:space="preserve"> </w:t>
-      </w:r>
-      <w:r>
-        <w:rPr>
-          <w:rFonts w:ascii="Calibri" w:hAnsi="Calibri" w:cs="Calibri"/>
-          <w:lang w:val="en-GB"/>
-        </w:rPr>
-        <w:t xml:space="preserve">requires students to have full commitment to academic integrity when engaging in research and academic activities. </w:t>
-      </w:r>
-      <w:r>
-        <w:rPr>
-          <w:rFonts w:ascii="Calibri" w:hAnsi="Calibri" w:cs="Calibri"/>
-          <w:lang w:val="en-GB"/>
-        </w:rPr>
-        <w:t xml:space="preserve">Violations of academic integrity, which include but are not limited to plagiarism, collusion, fabrication or </w:t>
-      </w:r>
-      <w:r>
-        <w:rPr>
-          <w:rFonts w:ascii="Calibri" w:hAnsi="Calibri" w:cs="Calibri"/>
-          <w:lang w:val="en-GB"/>
-        </w:rPr>
-        <w:t>falsification</w:t>
-      </w:r>
-      <w:r>
-        <w:rPr>
-          <w:rFonts w:ascii="Calibri" w:hAnsi="Calibri" w:cs="Calibri"/>
-          <w:lang w:val="en-GB"/>
-        </w:rPr>
-        <w:t>, r</w:t>
-      </w:r>
-      <w:r>
-        <w:rPr>
-          <w:rFonts w:ascii="Calibri" w:hAnsi="Calibri" w:cs="Calibri"/>
-          <w:lang w:val="en-GB"/>
-        </w:rPr>
-        <w:t xml:space="preserve">epeated use of assignments </w:t>
-      </w:r>
-      <w:r>
-        <w:rPr>
-          <w:rFonts w:ascii="Calibri" w:hAnsi="Calibri" w:cs="Calibri"/>
-          <w:lang w:val="en-GB"/>
-        </w:rPr>
-        <w:t xml:space="preserve">and cheating in examinations, </w:t>
-      </w:r>
-      <w:r>
-        <w:rPr>
-          <w:rFonts w:ascii="Calibri" w:hAnsi="Calibri" w:cs="Calibri"/>
-          <w:lang w:val="en-GB"/>
-        </w:rPr>
-        <w:t xml:space="preserve">are considered as serious academic offenses and may lead to </w:t>
-      </w:r>
-      <w:r>
-        <w:rPr>
-          <w:rFonts w:ascii="Calibri" w:hAnsi="Calibri" w:cs="Calibri"/>
-          <w:lang w:val="en-GB"/>
-        </w:rPr>
-        <w:t>disciplinary actions</w:t>
-      </w:r>
-      <w:r>
-        <w:rPr>
-          <w:rFonts w:ascii="Calibri" w:hAnsi="Calibri" w:cs="Calibri"/>
-          <w:lang w:val="en-GB"/>
-        </w:rPr>
-        <w:t>. Students should read the relevant regulations and guidelines in the Student Handbook which is distributed upon the admission into the University</w:t>
-      </w:r>
-      <w:r>
-        <w:rPr>
-          <w:rFonts w:ascii="Calibri" w:hAnsi="Calibri" w:cs="Calibri"/>
-          <w:lang w:val="en-GB"/>
-        </w:rPr>
-        <w:t xml:space="preserve">, a copy of which can </w:t>
-      </w:r>
-      <w:r>
-        <w:rPr>
-          <w:rFonts w:ascii="Calibri" w:hAnsi="Calibri" w:cs="Calibri"/>
-          <w:lang w:val="en-GB"/>
-        </w:rPr>
-        <w:t xml:space="preserve">also </w:t>
-      </w:r>
-      <w:r>
-        <w:rPr>
-          <w:rFonts w:ascii="Calibri" w:hAnsi="Calibri" w:cs="Calibri"/>
-          <w:lang w:val="en-GB"/>
-        </w:rPr>
-        <w:t xml:space="preserve">be found at </w:t>
-      </w:r>
-      <w:hyperlink r:id="rId9" w:history="1">
-        <w:r>
-          <w:rPr>
-            <w:rStyle w:val="a3"/>
-            <w:rFonts w:ascii="Calibri" w:hAnsi="Calibri" w:cs="Calibri"/>
-            <w:lang w:val="en-GB"/>
-          </w:rPr>
-          <w:t>www.mpu.edu.mo/student_handbook/</w:t>
-        </w:r>
-      </w:hyperlink>
-      <w:r>
-        <w:rPr>
-          <w:rFonts w:ascii="Calibri" w:hAnsi="Calibri" w:cs="Calibri"/>
-          <w:lang w:val="en-GB"/>
-        </w:rPr>
-        <w:t>.</w:t>
+        <w:t>The Macao Polytechnic University requires every student to be fully committed to academic integrity in their research and academic activities. Violations of academic integrity, which include but are not limited to plagiarism, collusion, fabrication or falsification, reuse of one’s own work and examination cheating, are regarded as serious academic offences that may lead to disciplinary action. Students should read the relevant regulations and guidelines in the Student Handbook which is distributed upon admission into the University.</w:t>
+      </w:r>
+      <w:r>
+        <w:rPr>
+          <w:rFonts w:ascii="Calibri" w:hAnsi="Calibri" w:cs="Calibri"/>
+          <w:lang w:val="en-GB"/>
+        </w:rPr>
+      </w:r>
+      <w:r>
+        <w:rPr>
+          <w:rFonts w:ascii="Calibri" w:hAnsi="Calibri" w:cs="Calibri"/>
+          <w:lang w:val="en-GB"/>
+        </w:rPr>
+      </w:r>
+      <w:r>
+        <w:rPr>
+          <w:rFonts w:ascii="Calibri" w:hAnsi="Calibri" w:cs="Calibri"/>
+          <w:lang w:val="en-GB"/>
+        </w:rPr>
+      </w:r>
+      <w:r>
+        <w:rPr>
+          <w:rFonts w:ascii="Calibri" w:hAnsi="Calibri" w:cs="Calibri"/>
+          <w:lang w:val="en-GB"/>
+        </w:rPr>
+      </w:r>
+      <w:r>
+        <w:rPr>
+          <w:rFonts w:ascii="Calibri" w:hAnsi="Calibri" w:cs="Calibri"/>
+          <w:lang w:val="en-GB"/>
+        </w:rPr>
+      </w:r>
+      <w:r>
+        <w:rPr>
+          <w:rFonts w:ascii="Calibri" w:hAnsi="Calibri" w:cs="Calibri"/>
+          <w:lang w:val="en-GB"/>
+        </w:rPr>
+      </w:r>
+      <w:r>
+        <w:rPr>
+          <w:rFonts w:ascii="Calibri" w:hAnsi="Calibri" w:cs="Calibri"/>
+          <w:lang w:val="en-GB"/>
+        </w:rPr>
+      </w:r>
+      <w:r>
+        <w:rPr>
+          <w:rFonts w:ascii="Calibri" w:hAnsi="Calibri" w:cs="Calibri"/>
+          <w:lang w:val="en-GB"/>
+        </w:rPr>
+      </w:r>
+      <w:r>
+        <w:rPr>
+          <w:rFonts w:ascii="Calibri" w:hAnsi="Calibri" w:cs="Calibri"/>
+          <w:lang w:val="en-GB"/>
+        </w:rPr>
+      </w:r>
+      <w:r>
+        <w:rPr>
+          <w:rFonts w:ascii="Calibri" w:hAnsi="Calibri" w:cs="Calibri"/>
+          <w:lang w:val="en-GB"/>
+        </w:rPr>
+      </w:r>
+      <w:r>
+        <w:rPr>
+          <w:rFonts w:ascii="Calibri" w:hAnsi="Calibri" w:cs="Calibri"/>
+          <w:lang w:val="en-GB"/>
+        </w:rPr>
+      </w:r>
+      <w:r>
+        <w:rPr>
+          <w:rFonts w:ascii="Calibri" w:hAnsi="Calibri" w:cs="Calibri"/>
+          <w:lang w:val="en-GB"/>
+        </w:rPr>
+      </w:r>
+      <w:r>
+        <w:rPr>
+          <w:rFonts w:ascii="Calibri" w:hAnsi="Calibri" w:cs="Calibri"/>
+          <w:lang w:val="en-GB"/>
+        </w:rPr>
+      </w:r>
+      <w:r>
+        <w:rPr>
+          <w:rFonts w:ascii="Calibri" w:hAnsi="Calibri" w:cs="Calibri"/>
+          <w:lang w:val="en-GB"/>
+        </w:rPr>
       </w:r>
     </w:p>
     <w:sectPr>

</xml_diff>

<commit_message>
feat: add joint-class grouping, master workbook import, and UI improvements
- Consolidate joint classes into single outlines via Joint_Relationship graph
- Update import_excel.py with strict header validation, atomic DB replacement, and legacy aliases
- Add rule_value and joint_relationship columns to schema.sql
- Improve generator.py with null-safe fields, attendance text, prerequisite defaults, and docx validation
- Update frontend with dynamic academic year loading and joint-class indicators
- Update convert_template.py for new template structure
- Update README with new column names, joint-class docs, and test instructions
- Add tests/ directory with generator and import regression tests
</commit_message>
<xml_diff>
--- a/backend/templates/template_en.docx
+++ b/backend/templates/template_en.docx
@@ -700,7 +700,6 @@
           <w:rFonts w:ascii="Calibri" w:hAnsi="Calibri" w:cs="Calibri"/>
           <w:lang w:val="en-GB"/>
         </w:rPr>
-        <w:t>[insert text]</w:t>
       </w:r>
     </w:p>
     <w:p>
@@ -3495,7 +3494,7 @@
           <w:rFonts w:ascii="Calibri" w:hAnsi="Calibri" w:cs="Calibri"/>
           <w:lang w:val="en-GB"/>
         </w:rPr>
-        <w:t>Attendance requirements are governed by the Academic Regulations Governing {{ degree_level }} Degree Programmes of the Macao Polytechnic University. Students who do not meet the attendance requirements for the learning module shall be awarded an ‘F’ grade.</w:t>
+        <w:t>{{ attendance_text }}</w:t>
       </w:r>
       <w:r>
         <w:rPr>
@@ -3917,37 +3916,59 @@
           <w:rFonts w:ascii="Calibri" w:hAnsi="Calibri" w:cs="Calibri"/>
           <w:lang w:val="en-GB"/>
         </w:rPr>
-        <w:t>The assessment will be conducted following the University’s Assessment Strategy. Passing this learning module indicates that students will have attained the ILOs of this learning module and thus acquired its credits.</w:t>
-      </w:r>
-      <w:r>
-        <w:rPr>
-          <w:rFonts w:ascii="Calibri" w:hAnsi="Calibri" w:cs="Calibri"/>
-          <w:lang w:val="en-GB"/>
-        </w:rPr>
-      </w:r>
-      <w:r>
-        <w:rPr>
-          <w:rFonts w:ascii="Calibri" w:hAnsi="Calibri" w:cs="Calibri"/>
-          <w:lang w:val="en-GB"/>
-        </w:rPr>
-      </w:r>
-      <w:r>
-        <w:rPr>
-          <w:rFonts w:ascii="Calibri" w:hAnsi="Calibri" w:cs="Calibri"/>
-          <w:lang w:val="en-GB"/>
-        </w:rPr>
-      </w:r>
-      <w:r>
-        <w:rPr>
-          <w:rFonts w:ascii="Calibri" w:hAnsi="Calibri" w:cs="Calibri"/>
-          <w:lang w:val="en-GB"/>
-        </w:rPr>
-      </w:r>
-      <w:r>
-        <w:rPr>
-          <w:rFonts w:ascii="Calibri" w:hAnsi="Calibri" w:cs="Calibri"/>
-          <w:lang w:val="en-GB"/>
-        </w:rPr>
+        <w:t xml:space="preserve">The assessment will be conducted </w:t>
+      </w:r>
+      <w:r>
+        <w:rPr>
+          <w:rFonts w:ascii="Calibri" w:hAnsi="Calibri" w:cs="Calibri"/>
+          <w:lang w:val="en-GB"/>
+        </w:rPr>
+        <w:t xml:space="preserve">following the University’s </w:t>
+      </w:r>
+      <w:r>
+        <w:rPr>
+          <w:rFonts w:ascii="Calibri" w:hAnsi="Calibri" w:cs="Calibri"/>
+          <w:lang w:val="en-GB"/>
+        </w:rPr>
+        <w:t>Assessment Strategy</w:t>
+      </w:r>
+      <w:r>
+        <w:rPr>
+          <w:rFonts w:ascii="Calibri" w:hAnsi="Calibri" w:cs="Calibri"/>
+          <w:lang w:val="en-GB"/>
+        </w:rPr>
+        <w:t xml:space="preserve"> (see</w:t>
+      </w:r>
+      <w:r>
+        <w:rPr>
+          <w:rFonts w:ascii="Times New Roman" w:hAnsi="Times New Roman" w:cs="Times New Roman"/>
+          <w:sz w:val="28"/>
+          <w:szCs w:val="28"/>
+        </w:rPr>
+        <w:t xml:space="preserve"> </w:t>
+      </w:r>
+      <w:hyperlink r:id="rId8" w:history="1">
+        <w:r>
+          <w:rPr>
+            <w:rStyle w:val="a3"/>
+            <w:rFonts w:cstheme="minorHAnsi"/>
+          </w:rPr>
+          <w:t>https://www.mpu.edu.mo/en/teaching-and-learning-centre/quality-framework/student_assessment_and_examinations/assessment_strategy</w:t>
+        </w:r>
+      </w:hyperlink>
+      <w:r>
+        <w:rPr>
+          <w:rFonts w:ascii="Calibri" w:hAnsi="Calibri" w:cs="Calibri"/>
+          <w:lang w:val="en-GB"/>
+        </w:rPr>
+        <w:t>)</w:t>
+      </w:r>
+      <w:r>
+        <w:rPr>
+          <w:rFonts w:ascii="Calibri" w:hAnsi="Calibri" w:cs="Calibri"/>
+          <w:lang w:val="en-GB"/>
+        </w:rPr>
+        <w:t>. Passing this learning module indicates that students will have attained the ILOs of this learning module and thus acquired its credits.</w:t>
       </w:r>
     </w:p>
     <w:p>
@@ -4002,6 +4023,8 @@
           <w:lang w:val="en-GB"/>
         </w:rPr>
       </w:r>
+      <w:bookmarkStart w:id="0" w:name="_GoBack"/>
+      <w:bookmarkEnd w:id="0"/>
     </w:p>
     <w:p>
       <w:pPr>
@@ -4038,7 +4061,6 @@
           <w:rFonts w:ascii="Calibri" w:hAnsi="Calibri" w:cs="Calibri"/>
           <w:lang w:val="en-GB"/>
         </w:rPr>
-        <w:t>[insert text]</w:t>
       </w:r>
     </w:p>
     <w:p>
@@ -4085,7 +4107,6 @@
           <w:rFonts w:ascii="Calibri" w:hAnsi="Calibri" w:cs="Calibri"/>
           <w:lang w:val="en-GB"/>
         </w:rPr>
-        <w:t>[insert text]</w:t>
       </w:r>
     </w:p>
     <w:p>
@@ -4335,91 +4356,121 @@
           <w:rFonts w:ascii="Calibri" w:hAnsi="Calibri" w:cs="Calibri"/>
           <w:lang w:val="en-GB"/>
         </w:rPr>
-        <w:t>The Macao Polytechnic University requires every student to be fully committed to academic integrity in their research and academic activities. Violations of academic integrity, which include but are not limited to plagiarism, collusion, fabrication or falsification, reuse of one’s own work and examination cheating, are regarded as serious academic offences that may lead to disciplinary action. Students should read the relevant regulations and guidelines in the Student Handbook which is distributed upon admission into the University.</w:t>
-      </w:r>
-      <w:r>
-        <w:rPr>
-          <w:rFonts w:ascii="Calibri" w:hAnsi="Calibri" w:cs="Calibri"/>
-          <w:lang w:val="en-GB"/>
-        </w:rPr>
-      </w:r>
-      <w:r>
-        <w:rPr>
-          <w:rFonts w:ascii="Calibri" w:hAnsi="Calibri" w:cs="Calibri"/>
-          <w:lang w:val="en-GB"/>
-        </w:rPr>
-      </w:r>
-      <w:r>
-        <w:rPr>
-          <w:rFonts w:ascii="Calibri" w:hAnsi="Calibri" w:cs="Calibri"/>
-          <w:lang w:val="en-GB"/>
-        </w:rPr>
-      </w:r>
-      <w:r>
-        <w:rPr>
-          <w:rFonts w:ascii="Calibri" w:hAnsi="Calibri" w:cs="Calibri"/>
-          <w:lang w:val="en-GB"/>
-        </w:rPr>
-      </w:r>
-      <w:r>
-        <w:rPr>
-          <w:rFonts w:ascii="Calibri" w:hAnsi="Calibri" w:cs="Calibri"/>
-          <w:lang w:val="en-GB"/>
-        </w:rPr>
-      </w:r>
-      <w:r>
-        <w:rPr>
-          <w:rFonts w:ascii="Calibri" w:hAnsi="Calibri" w:cs="Calibri"/>
-          <w:lang w:val="en-GB"/>
-        </w:rPr>
-      </w:r>
-      <w:r>
-        <w:rPr>
-          <w:rFonts w:ascii="Calibri" w:hAnsi="Calibri" w:cs="Calibri"/>
-          <w:lang w:val="en-GB"/>
-        </w:rPr>
-      </w:r>
-      <w:r>
-        <w:rPr>
-          <w:rFonts w:ascii="Calibri" w:hAnsi="Calibri" w:cs="Calibri"/>
-          <w:lang w:val="en-GB"/>
-        </w:rPr>
-      </w:r>
-      <w:r>
-        <w:rPr>
-          <w:rFonts w:ascii="Calibri" w:hAnsi="Calibri" w:cs="Calibri"/>
-          <w:lang w:val="en-GB"/>
-        </w:rPr>
-      </w:r>
-      <w:r>
-        <w:rPr>
-          <w:rFonts w:ascii="Calibri" w:hAnsi="Calibri" w:cs="Calibri"/>
-          <w:lang w:val="en-GB"/>
-        </w:rPr>
-      </w:r>
-      <w:r>
-        <w:rPr>
-          <w:rFonts w:ascii="Calibri" w:hAnsi="Calibri" w:cs="Calibri"/>
-          <w:lang w:val="en-GB"/>
-        </w:rPr>
-      </w:r>
-      <w:r>
-        <w:rPr>
-          <w:rFonts w:ascii="Calibri" w:hAnsi="Calibri" w:cs="Calibri"/>
-          <w:lang w:val="en-GB"/>
-        </w:rPr>
-      </w:r>
-      <w:r>
-        <w:rPr>
-          <w:rFonts w:ascii="Calibri" w:hAnsi="Calibri" w:cs="Calibri"/>
-          <w:lang w:val="en-GB"/>
-        </w:rPr>
-      </w:r>
-      <w:r>
-        <w:rPr>
-          <w:rFonts w:ascii="Calibri" w:hAnsi="Calibri" w:cs="Calibri"/>
-          <w:lang w:val="en-GB"/>
-        </w:rPr>
+        <w:t>The Macao Polytechnic University</w:t>
+      </w:r>
+      <w:r>
+        <w:rPr>
+          <w:rFonts w:ascii="Calibri" w:hAnsi="Calibri" w:cs="Calibri"/>
+          <w:lang w:val="en-GB"/>
+        </w:rPr>
+        <w:t xml:space="preserve"> </w:t>
+      </w:r>
+      <w:r>
+        <w:rPr>
+          <w:rFonts w:ascii="Calibri" w:hAnsi="Calibri" w:cs="Calibri"/>
+          <w:lang w:val="en-GB"/>
+        </w:rPr>
+        <w:t xml:space="preserve">requires students to have full commitment to academic integrity when engaging in research and academic activities. </w:t>
+      </w:r>
+      <w:r>
+        <w:rPr>
+          <w:rFonts w:ascii="Calibri" w:hAnsi="Calibri" w:cs="Calibri"/>
+          <w:lang w:val="en-GB"/>
+        </w:rPr>
+        <w:t xml:space="preserve">Violations of academic integrity, which include but are not limited to plagiarism, collusion, fabrication or </w:t>
+      </w:r>
+      <w:r>
+        <w:rPr>
+          <w:rFonts w:ascii="Calibri" w:hAnsi="Calibri" w:cs="Calibri"/>
+          <w:lang w:val="en-GB"/>
+        </w:rPr>
+        <w:t>falsification</w:t>
+      </w:r>
+      <w:r>
+        <w:rPr>
+          <w:rFonts w:ascii="Calibri" w:hAnsi="Calibri" w:cs="Calibri"/>
+          <w:lang w:val="en-GB"/>
+        </w:rPr>
+        <w:t>, r</w:t>
+      </w:r>
+      <w:r>
+        <w:rPr>
+          <w:rFonts w:ascii="Calibri" w:hAnsi="Calibri" w:cs="Calibri"/>
+          <w:lang w:val="en-GB"/>
+        </w:rPr>
+        <w:t xml:space="preserve">epeated use of assignments </w:t>
+      </w:r>
+      <w:r>
+        <w:rPr>
+          <w:rFonts w:ascii="Calibri" w:hAnsi="Calibri" w:cs="Calibri"/>
+          <w:lang w:val="en-GB"/>
+        </w:rPr>
+        <w:t xml:space="preserve">and cheating in examinations, </w:t>
+      </w:r>
+      <w:r>
+        <w:rPr>
+          <w:rFonts w:ascii="Calibri" w:hAnsi="Calibri" w:cs="Calibri"/>
+          <w:lang w:val="en-GB"/>
+        </w:rPr>
+        <w:t xml:space="preserve">are considered as serious academic offenses and may lead to </w:t>
+      </w:r>
+      <w:r>
+        <w:rPr>
+          <w:rFonts w:ascii="Calibri" w:hAnsi="Calibri" w:cs="Calibri"/>
+          <w:lang w:val="en-GB"/>
+        </w:rPr>
+        <w:t>disciplinary actions</w:t>
+      </w:r>
+      <w:r>
+        <w:rPr>
+          <w:rFonts w:ascii="Calibri" w:hAnsi="Calibri" w:cs="Calibri"/>
+          <w:lang w:val="en-GB"/>
+        </w:rPr>
+        <w:t>. Students should read the relevant regulations and guidelines in the Student Handbook which is distributed upon the admission into the University</w:t>
+      </w:r>
+      <w:r>
+        <w:rPr>
+          <w:rFonts w:ascii="Calibri" w:hAnsi="Calibri" w:cs="Calibri"/>
+          <w:lang w:val="en-GB"/>
+        </w:rPr>
+        <w:t xml:space="preserve">, a copy of which can </w:t>
+      </w:r>
+      <w:r>
+        <w:rPr>
+          <w:rFonts w:ascii="Calibri" w:hAnsi="Calibri" w:cs="Calibri"/>
+          <w:lang w:val="en-GB"/>
+        </w:rPr>
+        <w:t xml:space="preserve">also </w:t>
+      </w:r>
+      <w:r>
+        <w:rPr>
+          <w:rFonts w:ascii="Calibri" w:hAnsi="Calibri" w:cs="Calibri"/>
+          <w:lang w:val="en-GB"/>
+        </w:rPr>
+        <w:t>be found at</w:t>
+      </w:r>
+      <w:r>
+        <w:rPr>
+          <w:rFonts w:ascii="Calibri" w:hAnsi="Calibri" w:cs="Calibri"/>
+          <w:lang w:val="en-GB"/>
+        </w:rPr>
+        <w:t xml:space="preserve"> </w:t>
+      </w:r>
+      <w:hyperlink r:id="rId9" w:history="1">
+        <w:r>
+          <w:rPr>
+            <w:rStyle w:val="a3"/>
+            <w:rFonts w:ascii="Times New Roman" w:hAnsi="Times New Roman" w:cs="Times New Roman"/>
+          </w:rPr>
+          <w:t>https://mpusite.mpu.edu.mo/studenthandbook/</w:t>
+        </w:r>
+      </w:hyperlink>
+      <w:r>
+        <w:rPr>
+          <w:rFonts w:ascii="Calibri" w:hAnsi="Calibri" w:cs="Calibri"/>
+          <w:lang w:val="en-GB"/>
+        </w:rPr>
+        <w:t>.</w:t>
       </w:r>
     </w:p>
     <w:sectPr>
@@ -4497,8 +4548,6 @@
       </w:rPr>
       <w:t>E-</w:t>
     </w:r>
-    <w:bookmarkStart w:id="0" w:name="_GoBack"/>
-    <w:bookmarkEnd w:id="0"/>
     <w:r>
       <w:rPr>
         <w:rFonts w:ascii="Calibri" w:hAnsi="Calibri" w:cs="Calibri"/>
@@ -5896,7 +5945,7 @@
 </file>
 
 <file path=customXml/itemProps1.xml><?xml version="1.0" encoding="utf-8"?>
-<ds:datastoreItem xmlns:ds="http://schemas.openxmlformats.org/officeDocument/2006/customXml" ds:itemID="{600D0A51-6F1A-48EC-A1FB-B044BF50FA5A}">
+<ds:datastoreItem xmlns:ds="http://schemas.openxmlformats.org/officeDocument/2006/customXml" ds:itemID="{D8797D47-28A3-4376-B025-FD14EFCF02E5}">
   <ds:schemaRefs>
     <ds:schemaRef ds:uri="http://schemas.openxmlformats.org/officeDocument/2006/bibliography"/>
   </ds:schemaRefs>

</xml_diff>

<commit_message>
feat: treat medium_of_instruction as authoritative, not derived from document language
</commit_message>
<xml_diff>
--- a/backend/templates/template_en.docx
+++ b/backend/templates/template_en.docx
@@ -3937,23 +3937,16 @@
           <w:rFonts w:ascii="Calibri" w:hAnsi="Calibri" w:cs="Calibri"/>
           <w:lang w:val="en-GB"/>
         </w:rPr>
-        <w:t xml:space="preserve"> (see</w:t>
-      </w:r>
-      <w:r>
-        <w:rPr>
-          <w:rFonts w:ascii="Times New Roman" w:hAnsi="Times New Roman" w:cs="Times New Roman"/>
-          <w:sz w:val="28"/>
-          <w:szCs w:val="28"/>
-        </w:rPr>
-        <w:t xml:space="preserve"> </w:t>
+        <w:t xml:space="preserve"> (see </w:t>
       </w:r>
       <w:hyperlink r:id="rId8" w:history="1">
         <w:r>
           <w:rPr>
             <w:rStyle w:val="a3"/>
-            <w:rFonts w:cstheme="minorHAnsi"/>
+            <w:rFonts w:ascii="Calibri" w:hAnsi="Calibri" w:cs="Calibri"/>
+            <w:lang w:val="en-GB"/>
           </w:rPr>
-          <w:t>https://www.mpu.edu.mo/en/teaching-and-learning-centre/quality-framework/student_assessment_and_examinations/assessment_strategy</w:t>
+          <w:t>www.mpu.edu.mo/teaching_learning/en/assessment_strategy.php</w:t>
         </w:r>
       </w:hyperlink>
       <w:r>
@@ -4023,8 +4016,6 @@
           <w:lang w:val="en-GB"/>
         </w:rPr>
       </w:r>
-      <w:bookmarkStart w:id="0" w:name="_GoBack"/>
-      <w:bookmarkEnd w:id="0"/>
     </w:p>
     <w:p>
       <w:pPr>
@@ -4447,22 +4438,16 @@
           <w:rFonts w:ascii="Calibri" w:hAnsi="Calibri" w:cs="Calibri"/>
           <w:lang w:val="en-GB"/>
         </w:rPr>
-        <w:t>be found at</w:t>
-      </w:r>
-      <w:r>
-        <w:rPr>
-          <w:rFonts w:ascii="Calibri" w:hAnsi="Calibri" w:cs="Calibri"/>
-          <w:lang w:val="en-GB"/>
-        </w:rPr>
-        <w:t xml:space="preserve"> </w:t>
+        <w:t xml:space="preserve">be found at </w:t>
       </w:r>
       <w:hyperlink r:id="rId9" w:history="1">
         <w:r>
           <w:rPr>
             <w:rStyle w:val="a3"/>
-            <w:rFonts w:ascii="Times New Roman" w:hAnsi="Times New Roman" w:cs="Times New Roman"/>
+            <w:rFonts w:ascii="Calibri" w:hAnsi="Calibri" w:cs="Calibri"/>
+            <w:lang w:val="en-GB"/>
           </w:rPr>
-          <w:t>https://mpusite.mpu.edu.mo/studenthandbook/</w:t>
+          <w:t>www.mpu.edu.mo/student_handbook/</w:t>
         </w:r>
       </w:hyperlink>
       <w:r>
@@ -4548,6 +4533,8 @@
       </w:rPr>
       <w:t>E-</w:t>
     </w:r>
+    <w:bookmarkStart w:id="0" w:name="_GoBack"/>
+    <w:bookmarkEnd w:id="0"/>
     <w:r>
       <w:rPr>
         <w:rFonts w:ascii="Calibri" w:hAnsi="Calibri" w:cs="Calibri"/>
@@ -5945,7 +5932,7 @@
 </file>
 
 <file path=customXml/itemProps1.xml><?xml version="1.0" encoding="utf-8"?>
-<ds:datastoreItem xmlns:ds="http://schemas.openxmlformats.org/officeDocument/2006/customXml" ds:itemID="{D8797D47-28A3-4376-B025-FD14EFCF02E5}">
+<ds:datastoreItem xmlns:ds="http://schemas.openxmlformats.org/officeDocument/2006/customXml" ds:itemID="{600D0A51-6F1A-48EC-A1FB-B044BF50FA5A}">
   <ds:schemaRefs>
     <ds:schemaRef ds:uri="http://schemas.openxmlformats.org/officeDocument/2006/bibliography"/>
   </ds:schemaRefs>

</xml_diff>